<commit_message>
Motion for rehearing: verbatim quotes from the recording, new Ground 8 on inconsistent treatment of ZBA2026-055; add hearing transcript; expand records request
Co-Authored-By: Claude Fable 5.1 <noreply@anthropic.com>
Claude-Session: https://claude.ai/code/session_01DfqmJDEjm2Gwtio86GAUCf
</commit_message>
<xml_diff>
--- a/documents/Titus_Ave_Records_Request.docx
+++ b/documents/Titus_Ave_Records_Request.docx
@@ -206,7 +206,24 @@
           <w:sz w:val="22"/>
           <w:szCs w:val="22"/>
         </w:rPr>
-        <w:t xml:space="preserve">The records of the City's 2024 conveyance of Map 554, Lot 17C to T&amp;L 2018, LLC, including the Board of Mayor and Aldermen resolution or vote authorizing the sale, committee reports, any appraisal or valuation, the request for proposals or bid documents if any, the purchase and sale agreement, and the recorded deed (Hillsborough County Registry Book 9788, Page 1181).</w:t>
+        <w:t xml:space="preserve">The records of the City's 2024 conveyance of Map 554, Lot 17C to T&amp;L 2018, LLC, including the Board of Mayor and Aldermen resolution or vote authorizing the sale, committee reports, any appraisal or valuation, the auction notice, terms and conditions of sale, bid results, the purchase and sale agreement, and the recorded deed (Hillsborough County Registry Book 9788, Page 1181). At the September 10 hearing the owner stated that he purchased the parcel at a City auction and that the Mayor was “on record” regarding the intended use of surplus City property; please include any statement, press release, or minutes reflecting that.</w:t>
+      </w:r>
+    </w:p>
+    <w:p>
+      <w:pPr>
+        <w:pStyle w:val="ListParagraph"/>
+        <w:numPr>
+          <w:ilvl w:val="0"/>
+          <w:numId w:val="2"/>
+        </w:numPr>
+        <w:spacing w:after="100" w:line="300"/>
+      </w:pPr>
+      <w:r>
+        <w:rPr>
+          <w:sz w:val="22"/>
+          <w:szCs w:val="22"/>
+        </w:rPr>
+        <w:t xml:space="preserve">The complete file for Case No. ZBA2026-055, 218 South Lincoln Street, heard immediately before Case No. ZBA2026-063 on September 10, 2026, including the written notice of decision, so that the two decisions may be compared.</w:t>
       </w:r>
     </w:p>
     <w:p>

</xml_diff>

<commit_message>
Records request: fix line breaks in address and signature blocks
Co-Authored-By: Claude Opus 5 <noreply@anthropic.com>
Claude-Session: https://claude.ai/code/session_01DfqmJDEjm2Gwtio86GAUCf
</commit_message>
<xml_diff>
--- a/documents/Titus_Ave_Records_Request.docx
+++ b/documents/Titus_Ave_Records_Request.docx
@@ -4,17 +4,46 @@
   <w:body>
     <w:p>
       <w:pPr>
-        <w:spacing w:after="130" w:line="300"/>
-      </w:pPr>
-      <w:r>
-        <w:rPr>
-          <w:sz w:val="22"/>
-          <w:szCs w:val="22"/>
-        </w:rPr>
-        <w:t xml:space="preserve">Nickolas J. Levasseur
-30 Mystic Street
-Manchester, NH 03103
-(603) 361-3828</w:t>
+        <w:spacing w:after="130" w:line="280"/>
+      </w:pPr>
+      <w:r>
+        <w:rPr>
+          <w:b w:val="false"/>
+          <w:bCs w:val="false"/>
+          <w:sz w:val="22"/>
+          <w:szCs w:val="22"/>
+        </w:rPr>
+        <w:t xml:space="preserve">Nickolas J. Levasseur</w:t>
+      </w:r>
+      <w:r>
+        <w:rPr>
+          <w:b w:val="false"/>
+          <w:bCs w:val="false"/>
+          <w:sz w:val="22"/>
+          <w:szCs w:val="22"/>
+        </w:rPr>
+        <w:br/>
+        <w:t xml:space="preserve">30 Mystic Street</w:t>
+      </w:r>
+      <w:r>
+        <w:rPr>
+          <w:b w:val="false"/>
+          <w:bCs w:val="false"/>
+          <w:sz w:val="22"/>
+          <w:szCs w:val="22"/>
+        </w:rPr>
+        <w:br/>
+        <w:t xml:space="preserve">Manchester, NH 03103</w:t>
+      </w:r>
+      <w:r>
+        <w:rPr>
+          <w:b w:val="false"/>
+          <w:bCs w:val="false"/>
+          <w:sz w:val="22"/>
+          <w:szCs w:val="22"/>
+        </w:rPr>
+        <w:br/>
+        <w:t xml:space="preserve">(603) 361-3828</w:t>
       </w:r>
     </w:p>
     <w:p>
@@ -42,31 +71,90 @@
     </w:p>
     <w:p>
       <w:pPr>
-        <w:spacing w:after="130" w:line="300"/>
-      </w:pPr>
-      <w:r>
-        <w:rPr>
-          <w:sz w:val="22"/>
-          <w:szCs w:val="22"/>
-        </w:rPr>
-        <w:t xml:space="preserve">City Clerk, City of Manchester
-One City Hall Plaza
-Manchester, NH 03101</w:t>
-      </w:r>
-    </w:p>
-    <w:p>
-      <w:pPr>
-        <w:spacing w:after="130" w:line="300"/>
-      </w:pPr>
-      <w:r>
-        <w:rPr>
-          <w:sz w:val="22"/>
-          <w:szCs w:val="22"/>
-        </w:rPr>
-        <w:t xml:space="preserve">Planning and Community Development Department
-One City Hall Plaza, West Wing
-Manchester, NH 03101
-pcd@manchesternh.gov</w:t>
+        <w:spacing w:after="130" w:line="280"/>
+      </w:pPr>
+      <w:r>
+        <w:rPr>
+          <w:b w:val="false"/>
+          <w:bCs w:val="false"/>
+          <w:sz w:val="22"/>
+          <w:szCs w:val="22"/>
+        </w:rPr>
+        <w:t xml:space="preserve">City Clerk, City of Manchester</w:t>
+      </w:r>
+      <w:r>
+        <w:rPr>
+          <w:b w:val="false"/>
+          <w:bCs w:val="false"/>
+          <w:sz w:val="22"/>
+          <w:szCs w:val="22"/>
+        </w:rPr>
+        <w:br/>
+        <w:t xml:space="preserve">One City Hall Plaza</w:t>
+      </w:r>
+      <w:r>
+        <w:rPr>
+          <w:b w:val="false"/>
+          <w:bCs w:val="false"/>
+          <w:sz w:val="22"/>
+          <w:szCs w:val="22"/>
+        </w:rPr>
+        <w:br/>
+        <w:t xml:space="preserve">Manchester, NH 03101</w:t>
+      </w:r>
+    </w:p>
+    <w:p>
+      <w:pPr>
+        <w:spacing w:after="130" w:line="280"/>
+      </w:pPr>
+      <w:r>
+        <w:rPr>
+          <w:b w:val="false"/>
+          <w:bCs w:val="false"/>
+          <w:sz w:val="22"/>
+          <w:szCs w:val="22"/>
+        </w:rPr>
+        <w:t xml:space="preserve">Jeffrey D. Belanger, AICP, Director</w:t>
+      </w:r>
+      <w:r>
+        <w:rPr>
+          <w:b w:val="false"/>
+          <w:bCs w:val="false"/>
+          <w:sz w:val="22"/>
+          <w:szCs w:val="22"/>
+        </w:rPr>
+        <w:br/>
+        <w:t xml:space="preserve">Planning and Community Development Department</w:t>
+      </w:r>
+      <w:r>
+        <w:rPr>
+          <w:b w:val="false"/>
+          <w:bCs w:val="false"/>
+          <w:sz w:val="22"/>
+          <w:szCs w:val="22"/>
+        </w:rPr>
+        <w:br/>
+        <w:t xml:space="preserve">One City Hall Plaza, West Wing</w:t>
+      </w:r>
+      <w:r>
+        <w:rPr>
+          <w:b w:val="false"/>
+          <w:bCs w:val="false"/>
+          <w:sz w:val="22"/>
+          <w:szCs w:val="22"/>
+        </w:rPr>
+        <w:br/>
+        <w:t xml:space="preserve">Manchester, NH 03101</w:t>
+      </w:r>
+      <w:r>
+        <w:rPr>
+          <w:b w:val="false"/>
+          <w:bCs w:val="false"/>
+          <w:sz w:val="22"/>
+          <w:szCs w:val="22"/>
+        </w:rPr>
+        <w:br/>
+        <w:t xml:space="preserve">pcd@manchesternh.gov</w:t>
       </w:r>
     </w:p>
     <w:p>
@@ -293,20 +381,63 @@
     </w:p>
     <w:p>
       <w:pPr>
-        <w:spacing w:after="300"/>
-      </w:pPr>
-    </w:p>
-    <w:p>
-      <w:pPr>
-        <w:spacing w:after="130" w:line="300"/>
-      </w:pPr>
-      <w:r>
-        <w:rPr>
-          <w:sz w:val="22"/>
-          <w:szCs w:val="22"/>
-        </w:rPr>
-        <w:t xml:space="preserve">______________________________
-Nickolas J. Levasseur</w:t>
+        <w:spacing w:after="420"/>
+      </w:pPr>
+    </w:p>
+    <w:p>
+      <w:pPr>
+        <w:spacing w:after="40"/>
+      </w:pPr>
+      <w:r>
+        <w:rPr>
+          <w:sz w:val="22"/>
+          <w:szCs w:val="22"/>
+        </w:rPr>
+        <w:t xml:space="preserve">______________________________</w:t>
+      </w:r>
+    </w:p>
+    <w:p>
+      <w:pPr>
+        <w:spacing w:after="0" w:line="280"/>
+      </w:pPr>
+      <w:r>
+        <w:rPr>
+          <w:b w:val="false"/>
+          <w:bCs w:val="false"/>
+          <w:sz w:val="22"/>
+          <w:szCs w:val="22"/>
+        </w:rPr>
+        <w:t xml:space="preserve">Nickolas J. Levasseur</w:t>
+      </w:r>
+      <w:r>
+        <w:rPr>
+          <w:b w:val="false"/>
+          <w:bCs w:val="false"/>
+          <w:sz w:val="22"/>
+          <w:szCs w:val="22"/>
+        </w:rPr>
+        <w:br/>
+        <w:t xml:space="preserve">30 Mystic Street, Manchester, NH 03103</w:t>
+      </w:r>
+      <w:r>
+        <w:rPr>
+          <w:b w:val="false"/>
+          <w:bCs w:val="false"/>
+          <w:sz w:val="22"/>
+          <w:szCs w:val="22"/>
+        </w:rPr>
+        <w:br/>
+        <w:t xml:space="preserve">(603) 361-3828</w:t>
+      </w:r>
+      <w:r>
+        <w:rPr>
+          <w:b w:val="false"/>
+          <w:bCs w:val="false"/>
+          <w:sz w:val="22"/>
+          <w:szCs w:val="22"/>
+        </w:rPr>
+        <w:br/>
+        <w:t xml:space="preserve">agoodhighdea@gmail.com</w:t>
       </w:r>
     </w:p>
     <w:sectPr>

</xml_diff>